<commit_message>
P1-29 Word converter: text, styles, headings, title, revisions, fields
Adds run-level formatting (bold/italic through style inheritance and
w:val=0/false overrides), tab/break handling, tracked-change and
field-instruction skipping, and a Notes count for comments,
footnotes, endnotes, headers and footers. D-28 records a real
data-loss bug this work found in the P1-11 fixture generator: several
helpers returned a bare <w:r> spliced directly into the document body
instead of inside a <w:p>, which the old parser silently discarded.

Co-Authored-By: Claude Sonnet 5 <noreply@anthropic.com>
</commit_message>
<xml_diff>
--- a/e2e/fixtures/docx/big-20pages.docx
+++ b/e2e/fixtures/docx/big-20pages.docx
@@ -91,28 +91,30 @@
         <w:t xml:space="preserve">Figure 1:</w:t>
       </w:r>
     </w:p>
-    <w:r>
-      <w:drawing>
-        <wp:inline distT="0" distB="0" distL="0" distR="0">
-          <wp:extent cx="1000000" cy="750000"/>
-          <wp:docPr id="1" name="Picture" descr="Figure 1"/>
-          <a:graphic>
-            <a:graphicData uri="http://schemas.openxmlformats.org/drawingml/2006/picture">
-              <pic:pic>
-                <pic:blipFill>
-                  <a:blip r:embed="rIdImage1"/>
-                </pic:blipFill>
-                <pic:spPr>
-                  <a:xfrm>
-                    <a:ext cx="1000000" cy="750000"/>
-                  </a:xfrm>
-                </pic:spPr>
-              </pic:pic>
-            </a:graphicData>
-          </a:graphic>
-        </wp:inline>
-      </w:drawing>
-    </w:r>
+    <w:p>
+      <w:r>
+        <w:drawing>
+          <wp:inline distT="0" distB="0" distL="0" distR="0">
+            <wp:extent cx="1000000" cy="750000"/>
+            <wp:docPr id="1" name="Picture" descr="Figure 1"/>
+            <a:graphic>
+              <a:graphicData uri="http://schemas.openxmlformats.org/drawingml/2006/picture">
+                <pic:pic>
+                  <pic:blipFill>
+                    <a:blip r:embed="rIdImage1"/>
+                  </pic:blipFill>
+                  <pic:spPr>
+                    <a:xfrm>
+                      <a:ext cx="1000000" cy="750000"/>
+                    </a:xfrm>
+                  </pic:spPr>
+                </pic:pic>
+              </a:graphicData>
+            </a:graphic>
+          </wp:inline>
+        </w:drawing>
+      </w:r>
+    </w:p>
     <w:p>
       <w:pPr>
         <w:pStyle w:val="berschrift1"/>
@@ -194,28 +196,30 @@
         <w:t xml:space="preserve">Figure 2:</w:t>
       </w:r>
     </w:p>
-    <w:r>
-      <w:drawing>
-        <wp:inline distT="0" distB="0" distL="0" distR="0">
-          <wp:extent cx="1000000" cy="750000"/>
-          <wp:docPr id="1" name="Picture" descr="Figure 2"/>
-          <a:graphic>
-            <a:graphicData uri="http://schemas.openxmlformats.org/drawingml/2006/picture">
-              <pic:pic>
-                <pic:blipFill>
-                  <a:blip r:embed="rIdImage2"/>
-                </pic:blipFill>
-                <pic:spPr>
-                  <a:xfrm>
-                    <a:ext cx="1000000" cy="750000"/>
-                  </a:xfrm>
-                </pic:spPr>
-              </pic:pic>
-            </a:graphicData>
-          </a:graphic>
-        </wp:inline>
-      </w:drawing>
-    </w:r>
+    <w:p>
+      <w:r>
+        <w:drawing>
+          <wp:inline distT="0" distB="0" distL="0" distR="0">
+            <wp:extent cx="1000000" cy="750000"/>
+            <wp:docPr id="1" name="Picture" descr="Figure 2"/>
+            <a:graphic>
+              <a:graphicData uri="http://schemas.openxmlformats.org/drawingml/2006/picture">
+                <pic:pic>
+                  <pic:blipFill>
+                    <a:blip r:embed="rIdImage2"/>
+                  </pic:blipFill>
+                  <pic:spPr>
+                    <a:xfrm>
+                      <a:ext cx="1000000" cy="750000"/>
+                    </a:xfrm>
+                  </pic:spPr>
+                </pic:pic>
+              </a:graphicData>
+            </a:graphic>
+          </wp:inline>
+        </w:drawing>
+      </w:r>
+    </w:p>
     <w:p>
       <w:pPr>
         <w:pStyle w:val="berschrift1"/>
@@ -297,28 +301,30 @@
         <w:t xml:space="preserve">Figure 3:</w:t>
       </w:r>
     </w:p>
-    <w:r>
-      <w:drawing>
-        <wp:inline distT="0" distB="0" distL="0" distR="0">
-          <wp:extent cx="1000000" cy="750000"/>
-          <wp:docPr id="1" name="Picture" descr="Figure 3"/>
-          <a:graphic>
-            <a:graphicData uri="http://schemas.openxmlformats.org/drawingml/2006/picture">
-              <pic:pic>
-                <pic:blipFill>
-                  <a:blip r:embed="rIdImage3"/>
-                </pic:blipFill>
-                <pic:spPr>
-                  <a:xfrm>
-                    <a:ext cx="1000000" cy="750000"/>
-                  </a:xfrm>
-                </pic:spPr>
-              </pic:pic>
-            </a:graphicData>
-          </a:graphic>
-        </wp:inline>
-      </w:drawing>
-    </w:r>
+    <w:p>
+      <w:r>
+        <w:drawing>
+          <wp:inline distT="0" distB="0" distL="0" distR="0">
+            <wp:extent cx="1000000" cy="750000"/>
+            <wp:docPr id="1" name="Picture" descr="Figure 3"/>
+            <a:graphic>
+              <a:graphicData uri="http://schemas.openxmlformats.org/drawingml/2006/picture">
+                <pic:pic>
+                  <pic:blipFill>
+                    <a:blip r:embed="rIdImage3"/>
+                  </pic:blipFill>
+                  <pic:spPr>
+                    <a:xfrm>
+                      <a:ext cx="1000000" cy="750000"/>
+                    </a:xfrm>
+                  </pic:spPr>
+                </pic:pic>
+              </a:graphicData>
+            </a:graphic>
+          </wp:inline>
+        </w:drawing>
+      </w:r>
+    </w:p>
     <w:p>
       <w:pPr>
         <w:pStyle w:val="berschrift1"/>
@@ -400,28 +406,30 @@
         <w:t xml:space="preserve">Figure 4:</w:t>
       </w:r>
     </w:p>
-    <w:r>
-      <w:drawing>
-        <wp:inline distT="0" distB="0" distL="0" distR="0">
-          <wp:extent cx="1000000" cy="750000"/>
-          <wp:docPr id="1" name="Picture" descr="Figure 4"/>
-          <a:graphic>
-            <a:graphicData uri="http://schemas.openxmlformats.org/drawingml/2006/picture">
-              <pic:pic>
-                <pic:blipFill>
-                  <a:blip r:embed="rIdImage4"/>
-                </pic:blipFill>
-                <pic:spPr>
-                  <a:xfrm>
-                    <a:ext cx="1000000" cy="750000"/>
-                  </a:xfrm>
-                </pic:spPr>
-              </pic:pic>
-            </a:graphicData>
-          </a:graphic>
-        </wp:inline>
-      </w:drawing>
-    </w:r>
+    <w:p>
+      <w:r>
+        <w:drawing>
+          <wp:inline distT="0" distB="0" distL="0" distR="0">
+            <wp:extent cx="1000000" cy="750000"/>
+            <wp:docPr id="1" name="Picture" descr="Figure 4"/>
+            <a:graphic>
+              <a:graphicData uri="http://schemas.openxmlformats.org/drawingml/2006/picture">
+                <pic:pic>
+                  <pic:blipFill>
+                    <a:blip r:embed="rIdImage4"/>
+                  </pic:blipFill>
+                  <pic:spPr>
+                    <a:xfrm>
+                      <a:ext cx="1000000" cy="750000"/>
+                    </a:xfrm>
+                  </pic:spPr>
+                </pic:pic>
+              </a:graphicData>
+            </a:graphic>
+          </wp:inline>
+        </w:drawing>
+      </w:r>
+    </w:p>
     <w:p>
       <w:pPr>
         <w:pStyle w:val="berschrift1"/>
@@ -503,28 +511,30 @@
         <w:t xml:space="preserve">Figure 5:</w:t>
       </w:r>
     </w:p>
-    <w:r>
-      <w:drawing>
-        <wp:inline distT="0" distB="0" distL="0" distR="0">
-          <wp:extent cx="1000000" cy="750000"/>
-          <wp:docPr id="1" name="Picture" descr="Figure 5"/>
-          <a:graphic>
-            <a:graphicData uri="http://schemas.openxmlformats.org/drawingml/2006/picture">
-              <pic:pic>
-                <pic:blipFill>
-                  <a:blip r:embed="rIdImage5"/>
-                </pic:blipFill>
-                <pic:spPr>
-                  <a:xfrm>
-                    <a:ext cx="1000000" cy="750000"/>
-                  </a:xfrm>
-                </pic:spPr>
-              </pic:pic>
-            </a:graphicData>
-          </a:graphic>
-        </wp:inline>
-      </w:drawing>
-    </w:r>
+    <w:p>
+      <w:r>
+        <w:drawing>
+          <wp:inline distT="0" distB="0" distL="0" distR="0">
+            <wp:extent cx="1000000" cy="750000"/>
+            <wp:docPr id="1" name="Picture" descr="Figure 5"/>
+            <a:graphic>
+              <a:graphicData uri="http://schemas.openxmlformats.org/drawingml/2006/picture">
+                <pic:pic>
+                  <pic:blipFill>
+                    <a:blip r:embed="rIdImage5"/>
+                  </pic:blipFill>
+                  <pic:spPr>
+                    <a:xfrm>
+                      <a:ext cx="1000000" cy="750000"/>
+                    </a:xfrm>
+                  </pic:spPr>
+                </pic:pic>
+              </a:graphicData>
+            </a:graphic>
+          </wp:inline>
+        </w:drawing>
+      </w:r>
+    </w:p>
     <w:p>
       <w:pPr>
         <w:pStyle w:val="berschrift1"/>
@@ -606,28 +616,30 @@
         <w:t xml:space="preserve">Figure 6:</w:t>
       </w:r>
     </w:p>
-    <w:r>
-      <w:drawing>
-        <wp:inline distT="0" distB="0" distL="0" distR="0">
-          <wp:extent cx="1000000" cy="750000"/>
-          <wp:docPr id="1" name="Picture" descr="Figure 6"/>
-          <a:graphic>
-            <a:graphicData uri="http://schemas.openxmlformats.org/drawingml/2006/picture">
-              <pic:pic>
-                <pic:blipFill>
-                  <a:blip r:embed="rIdImage6"/>
-                </pic:blipFill>
-                <pic:spPr>
-                  <a:xfrm>
-                    <a:ext cx="1000000" cy="750000"/>
-                  </a:xfrm>
-                </pic:spPr>
-              </pic:pic>
-            </a:graphicData>
-          </a:graphic>
-        </wp:inline>
-      </w:drawing>
-    </w:r>
+    <w:p>
+      <w:r>
+        <w:drawing>
+          <wp:inline distT="0" distB="0" distL="0" distR="0">
+            <wp:extent cx="1000000" cy="750000"/>
+            <wp:docPr id="1" name="Picture" descr="Figure 6"/>
+            <a:graphic>
+              <a:graphicData uri="http://schemas.openxmlformats.org/drawingml/2006/picture">
+                <pic:pic>
+                  <pic:blipFill>
+                    <a:blip r:embed="rIdImage6"/>
+                  </pic:blipFill>
+                  <pic:spPr>
+                    <a:xfrm>
+                      <a:ext cx="1000000" cy="750000"/>
+                    </a:xfrm>
+                  </pic:spPr>
+                </pic:pic>
+              </a:graphicData>
+            </a:graphic>
+          </wp:inline>
+        </w:drawing>
+      </w:r>
+    </w:p>
     <w:p>
       <w:pPr>
         <w:pStyle w:val="berschrift1"/>
@@ -709,28 +721,30 @@
         <w:t xml:space="preserve">Figure 7:</w:t>
       </w:r>
     </w:p>
-    <w:r>
-      <w:drawing>
-        <wp:inline distT="0" distB="0" distL="0" distR="0">
-          <wp:extent cx="1000000" cy="750000"/>
-          <wp:docPr id="1" name="Picture" descr="Figure 7"/>
-          <a:graphic>
-            <a:graphicData uri="http://schemas.openxmlformats.org/drawingml/2006/picture">
-              <pic:pic>
-                <pic:blipFill>
-                  <a:blip r:embed="rIdImage7"/>
-                </pic:blipFill>
-                <pic:spPr>
-                  <a:xfrm>
-                    <a:ext cx="1000000" cy="750000"/>
-                  </a:xfrm>
-                </pic:spPr>
-              </pic:pic>
-            </a:graphicData>
-          </a:graphic>
-        </wp:inline>
-      </w:drawing>
-    </w:r>
+    <w:p>
+      <w:r>
+        <w:drawing>
+          <wp:inline distT="0" distB="0" distL="0" distR="0">
+            <wp:extent cx="1000000" cy="750000"/>
+            <wp:docPr id="1" name="Picture" descr="Figure 7"/>
+            <a:graphic>
+              <a:graphicData uri="http://schemas.openxmlformats.org/drawingml/2006/picture">
+                <pic:pic>
+                  <pic:blipFill>
+                    <a:blip r:embed="rIdImage7"/>
+                  </pic:blipFill>
+                  <pic:spPr>
+                    <a:xfrm>
+                      <a:ext cx="1000000" cy="750000"/>
+                    </a:xfrm>
+                  </pic:spPr>
+                </pic:pic>
+              </a:graphicData>
+            </a:graphic>
+          </wp:inline>
+        </w:drawing>
+      </w:r>
+    </w:p>
     <w:p>
       <w:pPr>
         <w:pStyle w:val="berschrift1"/>
@@ -812,28 +826,30 @@
         <w:t xml:space="preserve">Figure 8:</w:t>
       </w:r>
     </w:p>
-    <w:r>
-      <w:drawing>
-        <wp:inline distT="0" distB="0" distL="0" distR="0">
-          <wp:extent cx="1000000" cy="750000"/>
-          <wp:docPr id="1" name="Picture" descr="Figure 8"/>
-          <a:graphic>
-            <a:graphicData uri="http://schemas.openxmlformats.org/drawingml/2006/picture">
-              <pic:pic>
-                <pic:blipFill>
-                  <a:blip r:embed="rIdImage8"/>
-                </pic:blipFill>
-                <pic:spPr>
-                  <a:xfrm>
-                    <a:ext cx="1000000" cy="750000"/>
-                  </a:xfrm>
-                </pic:spPr>
-              </pic:pic>
-            </a:graphicData>
-          </a:graphic>
-        </wp:inline>
-      </w:drawing>
-    </w:r>
+    <w:p>
+      <w:r>
+        <w:drawing>
+          <wp:inline distT="0" distB="0" distL="0" distR="0">
+            <wp:extent cx="1000000" cy="750000"/>
+            <wp:docPr id="1" name="Picture" descr="Figure 8"/>
+            <a:graphic>
+              <a:graphicData uri="http://schemas.openxmlformats.org/drawingml/2006/picture">
+                <pic:pic>
+                  <pic:blipFill>
+                    <a:blip r:embed="rIdImage8"/>
+                  </pic:blipFill>
+                  <pic:spPr>
+                    <a:xfrm>
+                      <a:ext cx="1000000" cy="750000"/>
+                    </a:xfrm>
+                  </pic:spPr>
+                </pic:pic>
+              </a:graphicData>
+            </a:graphic>
+          </wp:inline>
+        </w:drawing>
+      </w:r>
+    </w:p>
     <w:p>
       <w:pPr>
         <w:pStyle w:val="berschrift1"/>
@@ -915,28 +931,30 @@
         <w:t xml:space="preserve">Figure 9:</w:t>
       </w:r>
     </w:p>
-    <w:r>
-      <w:drawing>
-        <wp:inline distT="0" distB="0" distL="0" distR="0">
-          <wp:extent cx="1000000" cy="750000"/>
-          <wp:docPr id="1" name="Picture" descr="Figure 9"/>
-          <a:graphic>
-            <a:graphicData uri="http://schemas.openxmlformats.org/drawingml/2006/picture">
-              <pic:pic>
-                <pic:blipFill>
-                  <a:blip r:embed="rIdImage9"/>
-                </pic:blipFill>
-                <pic:spPr>
-                  <a:xfrm>
-                    <a:ext cx="1000000" cy="750000"/>
-                  </a:xfrm>
-                </pic:spPr>
-              </pic:pic>
-            </a:graphicData>
-          </a:graphic>
-        </wp:inline>
-      </w:drawing>
-    </w:r>
+    <w:p>
+      <w:r>
+        <w:drawing>
+          <wp:inline distT="0" distB="0" distL="0" distR="0">
+            <wp:extent cx="1000000" cy="750000"/>
+            <wp:docPr id="1" name="Picture" descr="Figure 9"/>
+            <a:graphic>
+              <a:graphicData uri="http://schemas.openxmlformats.org/drawingml/2006/picture">
+                <pic:pic>
+                  <pic:blipFill>
+                    <a:blip r:embed="rIdImage9"/>
+                  </pic:blipFill>
+                  <pic:spPr>
+                    <a:xfrm>
+                      <a:ext cx="1000000" cy="750000"/>
+                    </a:xfrm>
+                  </pic:spPr>
+                </pic:pic>
+              </a:graphicData>
+            </a:graphic>
+          </wp:inline>
+        </w:drawing>
+      </w:r>
+    </w:p>
     <w:p>
       <w:pPr>
         <w:pStyle w:val="berschrift1"/>
@@ -1018,28 +1036,30 @@
         <w:t xml:space="preserve">Figure 10:</w:t>
       </w:r>
     </w:p>
-    <w:r>
-      <w:drawing>
-        <wp:inline distT="0" distB="0" distL="0" distR="0">
-          <wp:extent cx="1000000" cy="750000"/>
-          <wp:docPr id="1" name="Picture" descr="Figure 10"/>
-          <a:graphic>
-            <a:graphicData uri="http://schemas.openxmlformats.org/drawingml/2006/picture">
-              <pic:pic>
-                <pic:blipFill>
-                  <a:blip r:embed="rIdImage10"/>
-                </pic:blipFill>
-                <pic:spPr>
-                  <a:xfrm>
-                    <a:ext cx="1000000" cy="750000"/>
-                  </a:xfrm>
-                </pic:spPr>
-              </pic:pic>
-            </a:graphicData>
-          </a:graphic>
-        </wp:inline>
-      </w:drawing>
-    </w:r>
+    <w:p>
+      <w:r>
+        <w:drawing>
+          <wp:inline distT="0" distB="0" distL="0" distR="0">
+            <wp:extent cx="1000000" cy="750000"/>
+            <wp:docPr id="1" name="Picture" descr="Figure 10"/>
+            <a:graphic>
+              <a:graphicData uri="http://schemas.openxmlformats.org/drawingml/2006/picture">
+                <pic:pic>
+                  <pic:blipFill>
+                    <a:blip r:embed="rIdImage10"/>
+                  </pic:blipFill>
+                  <pic:spPr>
+                    <a:xfrm>
+                      <a:ext cx="1000000" cy="750000"/>
+                    </a:xfrm>
+                  </pic:spPr>
+                </pic:pic>
+              </a:graphicData>
+            </a:graphic>
+          </wp:inline>
+        </w:drawing>
+      </w:r>
+    </w:p>
     <w:sectPr/>
   </w:body>
 </w:document>

</xml_diff>